<commit_message>
chore: checkpoint — text node toolbar (markdown), title redesign, white border
Save current working state before WYSIWYG editor changes.

Co-Authored-By: Claude Opus 4.7 <noreply@anthropic.com>
</commit_message>
<xml_diff>
--- a/docs/AI多模态内容创作SaaS平台产品设计文档.docx
+++ b/docs/AI多模态内容创作SaaS平台产品设计文档.docx
@@ -64,145 +64,158 @@
         </w:rPr>
         <w:t>前后端分离，低耦合模式。</w:t>
       </w:r>
+    </w:p>
+    <w:p>
+      <w:pPr>
+        <w:rPr>
+          <w:rFonts w:hint="eastAsia"/>
+        </w:rPr>
+      </w:pPr>
+      <w:r>
+        <w:rPr>
+          <w:rFonts w:hint="eastAsia"/>
+        </w:rPr>
+        <w:t>前端技术栈</w:t>
+      </w:r>
+    </w:p>
+    <w:p>
+      <w:pPr>
+        <w:rPr>
+          <w:rFonts w:hint="eastAsia"/>
+        </w:rPr>
+      </w:pPr>
+      <w:r>
+        <w:rPr>
+          <w:rFonts w:hint="eastAsia"/>
+        </w:rPr>
+        <w:t>React / React DOM 18.3.1 + TypeScript 5.6.3 + Vite 5.4.14 + Ant Design 5.22.5 + Zustand 4.5.5 + Tailwind CSS 3.4.21 + ECharts 5.5.3</w:t>
+      </w:r>
+    </w:p>
+    <w:p>
+      <w:pPr>
+        <w:rPr>
+          <w:rFonts w:hint="eastAsia"/>
+        </w:rPr>
+      </w:pPr>
+      <w:r>
+        <w:rPr>
+          <w:rFonts w:hint="eastAsia"/>
+        </w:rPr>
+        <w:t>无限画布</w:t>
+      </w:r>
+      <w:r>
+        <w:rPr>
+          <w:rFonts w:hint="eastAsia"/>
+          <w:lang w:val="en-US" w:eastAsia="zh-CN"/>
+        </w:rPr>
+        <w:t>+节点</w:t>
+      </w:r>
+      <w:r>
+        <w:rPr>
+          <w:rFonts w:hint="eastAsia"/>
+        </w:rPr>
+        <w:t>引擎</w:t>
+      </w:r>
+    </w:p>
+    <w:p>
+      <w:pPr>
+        <w:rPr>
+          <w:rFonts w:hint="eastAsia"/>
+          <w:lang w:val="en-US" w:eastAsia="zh-CN"/>
+        </w:rPr>
+      </w:pPr>
+      <w:r>
+        <w:rPr>
+          <w:rFonts w:hint="eastAsia"/>
+        </w:rPr>
+        <w:t>@xyflow/react</w:t>
+      </w:r>
+      <w:r>
+        <w:rPr>
+          <w:rFonts w:hint="eastAsia"/>
+          <w:lang w:val="en-US" w:eastAsia="zh-CN"/>
+        </w:rPr>
+        <w:t xml:space="preserve"> 12.10.2 + Zustand</w:t>
+      </w:r>
+      <w:r>
+        <w:rPr>
+          <w:rFonts w:hint="eastAsia"/>
+        </w:rPr>
+        <w:t>4.5.5</w:t>
+      </w:r>
+      <w:r>
+        <w:rPr>
+          <w:rFonts w:hint="eastAsia"/>
+          <w:lang w:val="en-US" w:eastAsia="zh-CN"/>
+        </w:rPr>
+        <w:t xml:space="preserve"> + Socket.io</w:t>
+      </w:r>
+    </w:p>
+    <w:p>
+      <w:pPr>
+        <w:rPr>
+          <w:rFonts w:hint="eastAsia"/>
+        </w:rPr>
+      </w:pPr>
+      <w:r>
+        <w:rPr>
+          <w:rFonts w:hint="eastAsia"/>
+        </w:rPr>
+        <w:t>后端技术栈</w:t>
+      </w:r>
+    </w:p>
+    <w:p>
+      <w:pPr>
+        <w:rPr>
+          <w:rFonts w:hint="eastAsia"/>
+        </w:rPr>
+      </w:pPr>
+      <w:r>
+        <w:rPr>
+          <w:rFonts w:hint="eastAsia"/>
+        </w:rPr>
+        <w:t>Node.js 20.18.3 LTS + NestJS 10.4.18 + Prisma ORM 5.25.3 + PostgreSQL 16.8 + Better Auth</w:t>
+      </w:r>
+    </w:p>
+    <w:p>
+      <w:pPr>
+        <w:rPr>
+          <w:rFonts w:hint="eastAsia"/>
+        </w:rPr>
+      </w:pPr>
+      <w:r>
+        <w:rPr>
+          <w:rFonts w:hint="eastAsia"/>
+        </w:rPr>
+        <w:t>中间件技术栈</w:t>
+      </w:r>
+    </w:p>
+    <w:p>
+      <w:pPr>
+        <w:rPr>
+          <w:rFonts w:hint="eastAsia"/>
+        </w:rPr>
+      </w:pPr>
+      <w:r>
+        <w:rPr>
+          <w:rFonts w:hint="eastAsia"/>
+        </w:rPr>
+        <w:t>Redis 7.2.</w:t>
+      </w:r>
+      <w:r>
+        <w:rPr>
+          <w:rFonts w:hint="eastAsia"/>
+          <w:lang w:val="en-US" w:eastAsia="zh-CN"/>
+        </w:rPr>
+        <w:t>8</w:t>
+      </w:r>
       <w:bookmarkStart w:id="0" w:name="_GoBack"/>
       <w:bookmarkEnd w:id="0"/>
-    </w:p>
-    <w:p>
-      <w:pPr>
-        <w:rPr>
-          <w:rFonts w:hint="eastAsia"/>
-        </w:rPr>
-      </w:pPr>
-      <w:r>
-        <w:rPr>
-          <w:rFonts w:hint="eastAsia"/>
-        </w:rPr>
-        <w:t>前端技术栈</w:t>
-      </w:r>
-    </w:p>
-    <w:p>
-      <w:pPr>
-        <w:rPr>
-          <w:rFonts w:hint="eastAsia"/>
-        </w:rPr>
-      </w:pPr>
-      <w:r>
-        <w:rPr>
-          <w:rFonts w:hint="eastAsia"/>
-        </w:rPr>
-        <w:t>React / React DOM 18.3.1 + TypeScript 5.6.3 + Vite 5.4.14 + Ant Design 5.22.5 + Zustand 4.5.5 + Tailwind CSS 3.4.21 + ECharts 5.5.3</w:t>
-      </w:r>
-    </w:p>
-    <w:p>
-      <w:pPr>
-        <w:rPr>
-          <w:rFonts w:hint="eastAsia"/>
-        </w:rPr>
-      </w:pPr>
-      <w:r>
-        <w:rPr>
-          <w:rFonts w:hint="eastAsia"/>
-        </w:rPr>
-        <w:t>无限画布</w:t>
-      </w:r>
-      <w:r>
-        <w:rPr>
-          <w:rFonts w:hint="eastAsia"/>
-          <w:lang w:val="en-US" w:eastAsia="zh-CN"/>
-        </w:rPr>
-        <w:t>+节点</w:t>
-      </w:r>
-      <w:r>
-        <w:rPr>
-          <w:rFonts w:hint="eastAsia"/>
-        </w:rPr>
-        <w:t>引擎</w:t>
-      </w:r>
-    </w:p>
-    <w:p>
-      <w:pPr>
-        <w:rPr>
-          <w:rFonts w:hint="eastAsia"/>
-          <w:lang w:val="en-US" w:eastAsia="zh-CN"/>
-        </w:rPr>
-      </w:pPr>
-      <w:r>
-        <w:rPr>
-          <w:rFonts w:hint="eastAsia"/>
-        </w:rPr>
-        <w:t>@xyflow/react</w:t>
-      </w:r>
-      <w:r>
-        <w:rPr>
-          <w:rFonts w:hint="eastAsia"/>
-          <w:lang w:val="en-US" w:eastAsia="zh-CN"/>
-        </w:rPr>
-        <w:t xml:space="preserve"> 12.10.2 + Zustand</w:t>
-      </w:r>
-      <w:r>
-        <w:rPr>
-          <w:rFonts w:hint="eastAsia"/>
-        </w:rPr>
-        <w:t>4.5.5</w:t>
-      </w:r>
-      <w:r>
-        <w:rPr>
-          <w:rFonts w:hint="eastAsia"/>
-          <w:lang w:val="en-US" w:eastAsia="zh-CN"/>
-        </w:rPr>
-        <w:t xml:space="preserve"> + Socket.io</w:t>
-      </w:r>
-    </w:p>
-    <w:p>
-      <w:pPr>
-        <w:rPr>
-          <w:rFonts w:hint="eastAsia"/>
-        </w:rPr>
-      </w:pPr>
-      <w:r>
-        <w:rPr>
-          <w:rFonts w:hint="eastAsia"/>
-        </w:rPr>
-        <w:t>后端技术栈</w:t>
-      </w:r>
-    </w:p>
-    <w:p>
-      <w:pPr>
-        <w:rPr>
-          <w:rFonts w:hint="eastAsia"/>
-        </w:rPr>
-      </w:pPr>
-      <w:r>
-        <w:rPr>
-          <w:rFonts w:hint="eastAsia"/>
-        </w:rPr>
-        <w:t>Node.js 20.18.3 LTS + NestJS 10.4.18 + Prisma ORM 5.25.3 + PostgreSQL 16.8 + Keycloak Admin SDK 25.0.5</w:t>
-      </w:r>
-    </w:p>
-    <w:p>
-      <w:pPr>
-        <w:rPr>
-          <w:rFonts w:hint="eastAsia"/>
-        </w:rPr>
-      </w:pPr>
-      <w:r>
-        <w:rPr>
-          <w:rFonts w:hint="eastAsia"/>
-        </w:rPr>
-        <w:t>中间件技术栈</w:t>
-      </w:r>
-    </w:p>
-    <w:p>
-      <w:pPr>
-        <w:rPr>
-          <w:rFonts w:hint="eastAsia"/>
-        </w:rPr>
-      </w:pPr>
-      <w:r>
-        <w:rPr>
-          <w:rFonts w:hint="eastAsia"/>
-        </w:rPr>
-        <w:t>Redis 7.2.7 LTS + BullMQ 5.75.1 + MinIO RELEASE.2025-12-18T08-51-09Z LTS + Apache APISIX 3.15.1</w:t>
+      <w:r>
+        <w:rPr>
+          <w:rFonts w:hint="eastAsia"/>
+        </w:rPr>
+        <w:t xml:space="preserve"> LTS + BullMQ 5.75.1 + MinIO RELEASE.2025-12-18T08-51-09Z LTS + Apache APISIX 3.15.1</w:t>
       </w:r>
     </w:p>
     <w:p>

</xml_diff>